<commit_message>
feat(minuta): Parte I comum aos dois servicos, politica do servico tecnico e Superior de Dia estadual
- se-art-1 (finalidade) e se-art-2 (objetivos, +inciso X da seguranca contra
  incendio) generalizados para o servico operacional e o tecnico; ficam na
  Parte I ("Dos objetivos do Regulamento")
- se-art-3 (politica do servico operacional) abre o Titulo I da Parte II
- artigo novo "Da politica do servico tecnico" (seguranca-contra-incendio/
  ro-art-13-c1) abre o Titulo II; montarReestruturada aceita incluido citado
  pelo proprio id na ESTRUTURA (some na versao em consulta)
- Superior de Dia: alcance estadual mantido (deliberacao 15/09); se-art-31-c1
  deixa de ser proposta, competencias sem "na Capital"; nenhuma proposta
  pendente do CONDEG
- deliberacoes registradas; testes Python/JS, docs e pacote SEI regenerados
  (minuta publicavel 164 artigos)

Co-Authored-By: Claude Fable 5.1 <noreply@anthropic.com>
</commit_message>
<xml_diff>
--- a/docs/sei/2026-09-11-regulamento-servico/Minuta_Regulamento_de_Servico_CBMRO_versao_em_consulta.docx
+++ b/docs/sei/2026-09-11-regulamento-servico/Minuta_Regulamento_de_Servico_CBMRO_versao_em_consulta.docx
@@ -196,18 +196,7 @@
           <w:sz w:val="24"/>
           <w:szCs w:val="24"/>
         </w:rPr>
-        <w:t xml:space="preserve">O Corpo de Bombeiros Militar do Estado de Rondônia é força auxiliar e reserva do Exército, organizado com base na hierarquia e na disciplina, em conformidade com as disposições contidas na Constituição Federal, no Decreto-Lei n° 667, de 02 de julho de 1969, e Decreto Federal n° 88.777, de 30 de setembro de 1983, combinados com o Art. 148 da Constituição Estadual.</w:t>
-      </w:r>
-      <w:r>
-        <w:rPr>
-          <w:rFonts w:ascii="Times New Roman" w:cs="Times New Roman" w:eastAsia="Times New Roman" w:hAnsi="Times New Roman"/>
-          <w:i/>
-          <w:iCs/>
-          <w:color w:val="888888"/>
-          <w:sz w:val="18"/>
-          <w:szCs w:val="18"/>
-        </w:rPr>
-        <w:t xml:space="preserve"> [texto final aplicado]</w:t>
+        <w:t xml:space="preserve">O Corpo de Bombeiros Militar do Estado de Rondônia é força auxiliar e reserva do Exército, organizado com base na hierarquia e na disciplina, em conformidade com as disposições contidas na Constituição Federal, no Decreto-Lei n° 667, de 02 de julho de 1969, e Decreto Federal n° 88.777, de 30 de setembro de 1983, combinados com o Art. 82 da Constituição Estadual.</w:t>
       </w:r>
     </w:p>
     <w:p>
@@ -258,17 +247,6 @@
         </w:rPr>
         <w:t xml:space="preserve">Compete ao Corpo de Bombeiros Militar:</w:t>
       </w:r>
-      <w:r>
-        <w:rPr>
-          <w:rFonts w:ascii="Times New Roman" w:cs="Times New Roman" w:eastAsia="Times New Roman" w:hAnsi="Times New Roman"/>
-          <w:i/>
-          <w:iCs/>
-          <w:color w:val="888888"/>
-          <w:sz w:val="18"/>
-          <w:szCs w:val="18"/>
-        </w:rPr>
-        <w:t xml:space="preserve"> [texto final aplicado]</w:t>
-      </w:r>
     </w:p>
     <w:p>
       <w:pPr>
@@ -312,7 +290,7 @@
           <w:sz w:val="24"/>
           <w:szCs w:val="24"/>
         </w:rPr>
-        <w:t xml:space="preserve">III - Executar as atividades de defesa civil do Estado, dentro de sua área de competência no Sistema Estadual de Proteção e Defesa Civil</w:t>
+        <w:t xml:space="preserve">III - executar as atividades de defesa civil do Estado, dentro de sua área de competência no Sistema Estadual de Defesa Civil;</w:t>
       </w:r>
     </w:p>
     <w:p>
@@ -2537,31 +2515,20 @@
         </w:rPr>
         <w:t xml:space="preserve">A carga horária para o serviço administrativo e operacional será definida pelo Comando-Geral de acordo com a necessidade e interesse da Instituição, do aprimoramento técnico-profissional e das especificidades de cada setor que compõe a estrutura organizacional da Corporação, podendo ser alterada em determinados períodos ou por deficiência de efetivo, observando, ordinariamente, os seguintes critérios:</w:t>
       </w:r>
-      <w:r>
-        <w:rPr>
-          <w:rFonts w:ascii="Times New Roman" w:cs="Times New Roman" w:eastAsia="Times New Roman" w:hAnsi="Times New Roman"/>
-          <w:i/>
-          <w:iCs/>
-          <w:color w:val="888888"/>
-          <w:sz w:val="18"/>
-          <w:szCs w:val="18"/>
-        </w:rPr>
-        <w:t xml:space="preserve"> [texto final aplicado]</w:t>
-      </w:r>
-    </w:p>
-    <w:p>
-      <w:pPr>
-        <w:spacing w:after="60" w:line="360"/>
-        <w:ind w:left="708" w:hanging="340"/>
-        <w:jc w:val="both"/>
-      </w:pPr>
-      <w:r>
-        <w:rPr>
-          <w:rFonts w:ascii="Times New Roman" w:cs="Times New Roman" w:eastAsia="Times New Roman" w:hAnsi="Times New Roman"/>
-          <w:sz w:val="24"/>
-          <w:szCs w:val="24"/>
-        </w:rPr>
-        <w:t xml:space="preserve">I - as escalas para quem concorre exclusivamente ao serviço operacional serão:</w:t>
+    </w:p>
+    <w:p>
+      <w:pPr>
+        <w:spacing w:after="60" w:line="360"/>
+        <w:ind w:left="708" w:hanging="340"/>
+        <w:jc w:val="both"/>
+      </w:pPr>
+      <w:r>
+        <w:rPr>
+          <w:rFonts w:ascii="Times New Roman" w:cs="Times New Roman" w:eastAsia="Times New Roman" w:hAnsi="Times New Roman"/>
+          <w:sz w:val="24"/>
+          <w:szCs w:val="24"/>
+        </w:rPr>
+        <w:t xml:space="preserve">I - as escalas para que concorre exclusivamente ao serviço operacional serão:</w:t>
       </w:r>
     </w:p>
     <w:p>
@@ -2690,18 +2657,7 @@
           <w:sz w:val="24"/>
           <w:szCs w:val="24"/>
         </w:rPr>
-        <w:t xml:space="preserve">O serviço de Superior de Dia será realizado em regime de sobreaviso de 24 (vinte e quatro) horas, devendo o Oficial escalado não se ausentar da área de sua residência e permanecer com o telefone celular funcional ligado durante todo o dia de serviço ou outro meio de comunicação o qual deverá ser informado ao Subcomandante-Geral.</w:t>
-      </w:r>
-      <w:r>
-        <w:rPr>
-          <w:rFonts w:ascii="Times New Roman" w:cs="Times New Roman" w:eastAsia="Times New Roman" w:hAnsi="Times New Roman"/>
-          <w:i/>
-          <w:iCs/>
-          <w:color w:val="888888"/>
-          <w:sz w:val="18"/>
-          <w:szCs w:val="18"/>
-        </w:rPr>
-        <w:t xml:space="preserve"> [texto final aplicado]</w:t>
+        <w:t xml:space="preserve">O serviço de Superior de Dia será realizado em regime de sobreaviso de 24 (vinte e quatro) horas, devendo o Oficial escalado não se ausentar da área de sua residência e permanecer com o telefone celular funcional ligado durante todo o dia de serviço ou outro meio de comunicação o qual deverá ser informado ao Oficial de Dia.</w:t>
       </w:r>
     </w:p>
     <w:p>
@@ -2716,7 +2672,7 @@
           <w:sz w:val="24"/>
           <w:szCs w:val="24"/>
         </w:rPr>
-        <w:t xml:space="preserve">Ao final do serviço deverá assinar, via SEI, juntamente com o Oficial de Dia a Parte Diária.</w:t>
+        <w:t xml:space="preserve">§1.º Ao final do serviço deverá apor seu visto no livro de registro de ocorrências do Oficial de Dia.</w:t>
       </w:r>
     </w:p>
     <w:p>
@@ -2731,7 +2687,7 @@
           <w:sz w:val="24"/>
           <w:szCs w:val="24"/>
         </w:rPr>
-        <w:t xml:space="preserve">O regime do serviço poderá sofrer alterações mediante publicação em BG por determinação do Comandante-Geral ou pelo Subcomandante-Geral em virtude das necessidades do momento.</w:t>
+        <w:t xml:space="preserve">§2.º O regime do serviço poderá sofrer alterações mediante publicação em BGO por determinação do Comandante Geral e ou pelo Comandante Operacional de Bombeiros em virtude das necessidades do momento.</w:t>
       </w:r>
     </w:p>
     <w:p>
@@ -2756,18 +2712,7 @@
           <w:sz w:val="24"/>
           <w:szCs w:val="24"/>
         </w:rPr>
-        <w:t xml:space="preserve">A permuta de serviço do Superior de Dia, só será permitida mediante autorização por escrito do Subcomandante-Geral do CBMRO, após publicação em Boletim Geral.</w:t>
-      </w:r>
-      <w:r>
-        <w:rPr>
-          <w:rFonts w:ascii="Times New Roman" w:cs="Times New Roman" w:eastAsia="Times New Roman" w:hAnsi="Times New Roman"/>
-          <w:i/>
-          <w:iCs/>
-          <w:color w:val="888888"/>
-          <w:sz w:val="18"/>
-          <w:szCs w:val="18"/>
-        </w:rPr>
-        <w:t xml:space="preserve"> [texto final aplicado]</w:t>
+        <w:t xml:space="preserve">A permuta de serviço do Superior de Dia, só será permitida mediante autorização por escrito do Comandante Operacional de Bombeiros do CBMRO, após publicação em Boletim Geral Ostensivo.</w:t>
       </w:r>
     </w:p>
     <w:p>
@@ -2791,18 +2736,7 @@
           <w:sz w:val="24"/>
           <w:szCs w:val="24"/>
         </w:rPr>
-        <w:t xml:space="preserve">O serviço diário de Superior de Dia ao CBMRO será coordenado pelo Subcomandante-Geral, através do gabinete do Subcomando-Geral.</w:t>
-      </w:r>
-      <w:r>
-        <w:rPr>
-          <w:rFonts w:ascii="Times New Roman" w:cs="Times New Roman" w:eastAsia="Times New Roman" w:hAnsi="Times New Roman"/>
-          <w:i/>
-          <w:iCs/>
-          <w:color w:val="888888"/>
-          <w:sz w:val="18"/>
-          <w:szCs w:val="18"/>
-        </w:rPr>
-        <w:t xml:space="preserve"> [texto final aplicado]</w:t>
+        <w:t xml:space="preserve">O serviço diário de Superior de Dia ao CBMRO será coordenado pelo Comando Operacional de Bombeiros, através da sua Seção de Pessoal.</w:t>
       </w:r>
     </w:p>
     <w:p>
@@ -2842,18 +2776,7 @@
           <w:sz w:val="24"/>
           <w:szCs w:val="24"/>
         </w:rPr>
-        <w:t xml:space="preserve">O regime da escala de serviços diários de Superior de Dia obedecerá ao critério de dias corridos, podendo, a critério do Subcomandante-Geral ser alterado.</w:t>
-      </w:r>
-      <w:r>
-        <w:rPr>
-          <w:rFonts w:ascii="Times New Roman" w:cs="Times New Roman" w:eastAsia="Times New Roman" w:hAnsi="Times New Roman"/>
-          <w:i/>
-          <w:iCs/>
-          <w:color w:val="888888"/>
-          <w:sz w:val="18"/>
-          <w:szCs w:val="18"/>
-        </w:rPr>
-        <w:t xml:space="preserve"> [texto final aplicado]</w:t>
+        <w:t xml:space="preserve">O regime da escala de serviços diários de Superior de Dia obedecerá ao critério de dias corridos, podendo, a critério do Comandante Operacional de Bombeiros ser alterado.</w:t>
       </w:r>
     </w:p>
     <w:p>
@@ -2917,18 +2840,7 @@
           <w:sz w:val="24"/>
           <w:szCs w:val="24"/>
         </w:rPr>
-        <w:t xml:space="preserve">O militar que concorre à escala aqui tratada quando tiver que se ausentar ou retornar às suas atividades normais em decorrência de férias, dispensas, licenças ou que comporão as mesmas deverá se apresentar ao Subcomandante-Geral a fim de ser reinserido ou inserido na respectiva escala.</w:t>
-      </w:r>
-      <w:r>
-        <w:rPr>
-          <w:rFonts w:ascii="Times New Roman" w:cs="Times New Roman" w:eastAsia="Times New Roman" w:hAnsi="Times New Roman"/>
-          <w:i/>
-          <w:iCs/>
-          <w:color w:val="888888"/>
-          <w:sz w:val="18"/>
-          <w:szCs w:val="18"/>
-        </w:rPr>
-        <w:t xml:space="preserve"> [texto final aplicado]</w:t>
+        <w:t xml:space="preserve">O militar que concorre à escala aqui tratada quando tiver que se ausentar ou retornar às suas atividades normais em decorrência de férias, dispensas, licenças ou que comporão as mesmas deverá se apresentar ao Comandante Operacional de Bombeiros a fim de ser reinserido ou inserido na respectiva escala.</w:t>
       </w:r>
     </w:p>
     <w:p>
@@ -2952,18 +2864,7 @@
           <w:sz w:val="24"/>
           <w:szCs w:val="24"/>
         </w:rPr>
-        <w:t xml:space="preserve">Artigo em duplicidade com o Art. 10</w:t>
-      </w:r>
-      <w:r>
-        <w:rPr>
-          <w:rFonts w:ascii="Times New Roman" w:cs="Times New Roman" w:eastAsia="Times New Roman" w:hAnsi="Times New Roman"/>
-          <w:i/>
-          <w:iCs/>
-          <w:color w:val="888888"/>
-          <w:sz w:val="18"/>
-          <w:szCs w:val="18"/>
-        </w:rPr>
-        <w:t xml:space="preserve"> [texto final aplicado]</w:t>
+        <w:t xml:space="preserve">As permutas de serviços deverão ser solicitadas por escrito e encaminhadas ao Chefe da Seção de Pessoal do Comando Operacional de Bombeiros com antecedência mínima de 48 (quarenta e oito) horas.</w:t>
       </w:r>
     </w:p>
     <w:p>
@@ -3008,8 +2909,7 @@
     </w:p>
     <w:p>
       <w:pPr>
-        <w:spacing w:after="120" w:line="360"/>
-        <w:ind w:firstLine="708"/>
+        <w:spacing w:after="60" w:line="360"/>
         <w:jc w:val="both"/>
       </w:pPr>
       <w:r>
@@ -3028,18 +2928,22 @@
           <w:sz w:val="24"/>
           <w:szCs w:val="24"/>
         </w:rPr>
-        <w:t xml:space="preserve">(dispositivo suprimido — decisão registrada no portal)</w:t>
-      </w:r>
-      <w:r>
-        <w:rPr>
-          <w:rFonts w:ascii="Times New Roman" w:cs="Times New Roman" w:eastAsia="Times New Roman" w:hAnsi="Times New Roman"/>
-          <w:i/>
-          <w:iCs/>
-          <w:color w:val="888888"/>
-          <w:sz w:val="18"/>
-          <w:szCs w:val="18"/>
-        </w:rPr>
-        <w:t xml:space="preserve"> [texto final aplicado]</w:t>
+        <w:t xml:space="preserve">O serviço de Oficial de Dia será realizado em regime adequado de 24 (vinte e quatro) horas, podendo em casos excepcionais ser de 12 (doze) horas.</w:t>
+      </w:r>
+    </w:p>
+    <w:p>
+      <w:pPr>
+        <w:spacing w:after="60" w:line="360"/>
+        <w:ind w:left="708" w:hanging="0"/>
+        <w:jc w:val="both"/>
+      </w:pPr>
+      <w:r>
+        <w:rPr>
+          <w:rFonts w:ascii="Times New Roman" w:cs="Times New Roman" w:eastAsia="Times New Roman" w:hAnsi="Times New Roman"/>
+          <w:sz w:val="24"/>
+          <w:szCs w:val="24"/>
+        </w:rPr>
+        <w:t xml:space="preserve">Parágrafo único. Ao final do serviço deverá ser preenchido o livro de registro de ocorrências, o qual deverá constar o visto do Superior de Dia.</w:t>
       </w:r>
     </w:p>
     <w:p>
@@ -3069,8 +2973,7 @@
     </w:p>
     <w:p>
       <w:pPr>
-        <w:spacing w:after="120" w:line="360"/>
-        <w:ind w:firstLine="708"/>
+        <w:spacing w:after="60" w:line="360"/>
         <w:jc w:val="both"/>
       </w:pPr>
       <w:r>
@@ -3089,24 +2992,27 @@
           <w:sz w:val="24"/>
           <w:szCs w:val="24"/>
         </w:rPr>
-        <w:t xml:space="preserve">(dispositivo suprimido — decisão registrada no portal)</w:t>
-      </w:r>
-      <w:r>
-        <w:rPr>
-          <w:rFonts w:ascii="Times New Roman" w:cs="Times New Roman" w:eastAsia="Times New Roman" w:hAnsi="Times New Roman"/>
-          <w:i/>
-          <w:iCs/>
-          <w:color w:val="888888"/>
-          <w:sz w:val="18"/>
-          <w:szCs w:val="18"/>
-        </w:rPr>
-        <w:t xml:space="preserve"> [texto final aplicado]</w:t>
-      </w:r>
-    </w:p>
-    <w:p>
-      <w:pPr>
-        <w:spacing w:after="120" w:line="360"/>
-        <w:ind w:firstLine="708"/>
+        <w:t xml:space="preserve">O serviço diário de Oficial de Dia ao CBMRO será coordenado pelo Comando Operacional de Bombeiros, através da sua Seção de Pessoal.</w:t>
+      </w:r>
+    </w:p>
+    <w:p>
+      <w:pPr>
+        <w:spacing w:after="60" w:line="360"/>
+        <w:ind w:left="708" w:hanging="0"/>
+        <w:jc w:val="both"/>
+      </w:pPr>
+      <w:r>
+        <w:rPr>
+          <w:rFonts w:ascii="Times New Roman" w:cs="Times New Roman" w:eastAsia="Times New Roman" w:hAnsi="Times New Roman"/>
+          <w:sz w:val="24"/>
+          <w:szCs w:val="24"/>
+        </w:rPr>
+        <w:t xml:space="preserve">Parágrafo único. As escalas serão publicadas em Boletim Geral Ostensivo.</w:t>
+      </w:r>
+    </w:p>
+    <w:p>
+      <w:pPr>
+        <w:spacing w:after="60" w:line="360"/>
         <w:jc w:val="both"/>
       </w:pPr>
       <w:r>
@@ -3125,18 +3031,22 @@
           <w:sz w:val="24"/>
           <w:szCs w:val="24"/>
         </w:rPr>
-        <w:t xml:space="preserve">(dispositivo suprimido — decisão registrada no portal)</w:t>
-      </w:r>
-      <w:r>
-        <w:rPr>
-          <w:rFonts w:ascii="Times New Roman" w:cs="Times New Roman" w:eastAsia="Times New Roman" w:hAnsi="Times New Roman"/>
-          <w:i/>
-          <w:iCs/>
-          <w:color w:val="888888"/>
-          <w:sz w:val="18"/>
-          <w:szCs w:val="18"/>
-        </w:rPr>
-        <w:t xml:space="preserve"> [texto final aplicado]</w:t>
+        <w:t xml:space="preserve">Na publicação das escalas de Oficial de Dia constarão o nome do oficial escalado e do seu eventual substituto (Reserva).</w:t>
+      </w:r>
+    </w:p>
+    <w:p>
+      <w:pPr>
+        <w:spacing w:after="60" w:line="360"/>
+        <w:ind w:left="708" w:hanging="0"/>
+        <w:jc w:val="both"/>
+      </w:pPr>
+      <w:r>
+        <w:rPr>
+          <w:rFonts w:ascii="Times New Roman" w:cs="Times New Roman" w:eastAsia="Times New Roman" w:hAnsi="Times New Roman"/>
+          <w:sz w:val="24"/>
+          <w:szCs w:val="24"/>
+        </w:rPr>
+        <w:t xml:space="preserve">Parágrafo único. A escalação do oficial substituto (Reserva) obedecerá ao mesmo regime da respectiva escala.</w:t>
       </w:r>
     </w:p>
     <w:p>
@@ -3161,24 +3071,12 @@
           <w:sz w:val="24"/>
           <w:szCs w:val="24"/>
         </w:rPr>
-        <w:t xml:space="preserve">(dispositivo suprimido — decisão registrada no portal)</w:t>
-      </w:r>
-      <w:r>
-        <w:rPr>
-          <w:rFonts w:ascii="Times New Roman" w:cs="Times New Roman" w:eastAsia="Times New Roman" w:hAnsi="Times New Roman"/>
-          <w:i/>
-          <w:iCs/>
-          <w:color w:val="888888"/>
-          <w:sz w:val="18"/>
-          <w:szCs w:val="18"/>
-        </w:rPr>
-        <w:t xml:space="preserve"> [texto final aplicado]</w:t>
-      </w:r>
-    </w:p>
-    <w:p>
-      <w:pPr>
-        <w:spacing w:after="120" w:line="360"/>
-        <w:ind w:firstLine="708"/>
+        <w:t xml:space="preserve">O militar que concorre à escala aqui tratada quando tiver que se ausentar ou retornar às suas atividades normais em decorrência de férias, dispensas, licenças ou que comporão as mesmas deverá se apresentar ao Comandante Operacional de Bombeiros a fim de ser reinserido ou inserido na respectiva escala.</w:t>
+      </w:r>
+    </w:p>
+    <w:p>
+      <w:pPr>
+        <w:spacing w:after="60" w:line="360"/>
         <w:jc w:val="both"/>
       </w:pPr>
       <w:r>
@@ -3197,18 +3095,22 @@
           <w:sz w:val="24"/>
           <w:szCs w:val="24"/>
         </w:rPr>
-        <w:t xml:space="preserve">(dispositivo suprimido — decisão registrada no portal)</w:t>
-      </w:r>
-      <w:r>
-        <w:rPr>
-          <w:rFonts w:ascii="Times New Roman" w:cs="Times New Roman" w:eastAsia="Times New Roman" w:hAnsi="Times New Roman"/>
-          <w:i/>
-          <w:iCs/>
-          <w:color w:val="888888"/>
-          <w:sz w:val="18"/>
-          <w:szCs w:val="18"/>
-        </w:rPr>
-        <w:t xml:space="preserve"> [texto final aplicado]</w:t>
+        <w:t xml:space="preserve">As permutas de serviços deverão ser solicitadas por escrito e encaminhadas ao Chefe da Seção de Pessoal do Comando Operacional de Bombeiros com antecedência mínima de 48 (quarenta e oito) horas.</w:t>
+      </w:r>
+    </w:p>
+    <w:p>
+      <w:pPr>
+        <w:spacing w:after="60" w:line="360"/>
+        <w:ind w:left="708" w:hanging="0"/>
+        <w:jc w:val="both"/>
+      </w:pPr>
+      <w:r>
+        <w:rPr>
+          <w:rFonts w:ascii="Times New Roman" w:cs="Times New Roman" w:eastAsia="Times New Roman" w:hAnsi="Times New Roman"/>
+          <w:sz w:val="24"/>
+          <w:szCs w:val="24"/>
+        </w:rPr>
+        <w:t xml:space="preserve">Parágrafo único. Os interessados (substituto e substituído) em permutar o serviço deverão preencher o formulário padrão para esse tipo de solicitação existente na Seção de Pessoal do Comando Operacional de Bombeiros.</w:t>
       </w:r>
     </w:p>
     <w:p>
@@ -3233,18 +3135,7 @@
           <w:sz w:val="24"/>
           <w:szCs w:val="24"/>
         </w:rPr>
-        <w:t xml:space="preserve">(dispositivo suprimido — decisão registrada no portal)</w:t>
-      </w:r>
-      <w:r>
-        <w:rPr>
-          <w:rFonts w:ascii="Times New Roman" w:cs="Times New Roman" w:eastAsia="Times New Roman" w:hAnsi="Times New Roman"/>
-          <w:i/>
-          <w:iCs/>
-          <w:color w:val="888888"/>
-          <w:sz w:val="18"/>
-          <w:szCs w:val="18"/>
-        </w:rPr>
-        <w:t xml:space="preserve"> [texto final aplicado]</w:t>
+        <w:t xml:space="preserve">A área de atuação do Serviço de Superior de Dia ao CBMRO abrange todo o território estadual.</w:t>
       </w:r>
     </w:p>
     <w:p>
@@ -3333,18 +3224,7 @@
           <w:sz w:val="24"/>
           <w:szCs w:val="24"/>
         </w:rPr>
-        <w:t xml:space="preserve">Todos os aspectos relacionados ao serviço de Comandante de socorro e de Oficial de dia deverão observar às regras internas da OBM a que o Oficial estiver subordinado, além daquelas previstas neste Regulamento de Serviço.</w:t>
-      </w:r>
-      <w:r>
-        <w:rPr>
-          <w:rFonts w:ascii="Times New Roman" w:cs="Times New Roman" w:eastAsia="Times New Roman" w:hAnsi="Times New Roman"/>
-          <w:i/>
-          <w:iCs/>
-          <w:color w:val="888888"/>
-          <w:sz w:val="18"/>
-          <w:szCs w:val="18"/>
-        </w:rPr>
-        <w:t xml:space="preserve"> [texto final aplicado]</w:t>
+        <w:t xml:space="preserve">Todos os aspectos relacionados ao serviço de Comandante de socorro e de Oficial de dia deverão observar às regras internas da OBM a que o Oficial estiver subordinado, além daquelas previstas no RISG/EB quando essas funções forem equiparadas.</w:t>
       </w:r>
     </w:p>
     <w:p>
@@ -3394,18 +3274,7 @@
           <w:sz w:val="24"/>
           <w:szCs w:val="24"/>
         </w:rPr>
-        <w:t xml:space="preserve">Os casos omissos serão resolvidos em conjunto pelo Comandante Operacional de Bombeiros e pelo Comandante da OBM.</w:t>
-      </w:r>
-      <w:r>
-        <w:rPr>
-          <w:rFonts w:ascii="Times New Roman" w:cs="Times New Roman" w:eastAsia="Times New Roman" w:hAnsi="Times New Roman"/>
-          <w:i/>
-          <w:iCs/>
-          <w:color w:val="888888"/>
-          <w:sz w:val="18"/>
-          <w:szCs w:val="18"/>
-        </w:rPr>
-        <w:t xml:space="preserve"> [texto final aplicado]</w:t>
+        <w:t xml:space="preserve">Os casos omissos serão resolvidos em conjunto pelo Comandante Operacional de Bombeiros e pelo Comandante da OBM. Comandante de Guarnição – Do Condutor e Operador de Viaturas – Dos Auxiliares da Guarnição e do Operador de Rádio</w:t>
       </w:r>
     </w:p>
     <w:p>
@@ -3430,18 +3299,7 @@
           <w:sz w:val="24"/>
           <w:szCs w:val="24"/>
         </w:rPr>
-        <w:t xml:space="preserve">Em todas as Unidades Operacionais, Especializadas e Subunidade Operacionais do CBMRO, o regime das escalas de adjunto do oficial de dia, do comandante de guarnição, do condutor e operador de viaturas, dos auxiliares da guarnição e do operador de rádio obedecerá ao critério de trabalho de 24 horas, salvo em casos excepcionais adotar-se-á o regime de turno diferenciado.</w:t>
-      </w:r>
-      <w:r>
-        <w:rPr>
-          <w:rFonts w:ascii="Times New Roman" w:cs="Times New Roman" w:eastAsia="Times New Roman" w:hAnsi="Times New Roman"/>
-          <w:i/>
-          <w:iCs/>
-          <w:color w:val="888888"/>
-          <w:sz w:val="18"/>
-          <w:szCs w:val="18"/>
-        </w:rPr>
-        <w:t xml:space="preserve"> [texto final aplicado]</w:t>
+        <w:t xml:space="preserve">Em todas as Unidades Operacionais, Especializadas e Subunidade Operacionais do CBMRO, o regime das escalas de adjunto do oficial de dia, do comandante de guarnição, do condutor e operador de viaturas, dos auxiliares da guarnição e do operador de rádio obedecerá ao critério de trabalho de 24 horas, salvo em casos excepcion ais adotar-se-á o regime de turno diferenciado.</w:t>
       </w:r>
     </w:p>
     <w:p>
@@ -3466,18 +3324,7 @@
           <w:sz w:val="24"/>
           <w:szCs w:val="24"/>
         </w:rPr>
-        <w:t xml:space="preserve">Todos os aspectos relacionados a esses serviços deverão observar às regras internas da OBM a que as praças estiverem subordinadas além daquelas previstas neste Regulamento de Serviço.</w:t>
-      </w:r>
-      <w:r>
-        <w:rPr>
-          <w:rFonts w:ascii="Times New Roman" w:cs="Times New Roman" w:eastAsia="Times New Roman" w:hAnsi="Times New Roman"/>
-          <w:i/>
-          <w:iCs/>
-          <w:color w:val="888888"/>
-          <w:sz w:val="18"/>
-          <w:szCs w:val="18"/>
-        </w:rPr>
-        <w:t xml:space="preserve"> [texto final aplicado]</w:t>
+        <w:t xml:space="preserve">Todos os aspectos relacionados a esses serviços deverão observar às regras internas da OBM a que as praças estiverem subordinadas além daquelas previstas no RISG/EB quando essas funções forem equiparadas.</w:t>
       </w:r>
     </w:p>
     <w:p>
@@ -3502,18 +3349,7 @@
           <w:sz w:val="24"/>
           <w:szCs w:val="24"/>
         </w:rPr>
-        <w:t xml:space="preserve">(dispositivo suprimido — decisão registrada no portal)</w:t>
-      </w:r>
-      <w:r>
-        <w:rPr>
-          <w:rFonts w:ascii="Times New Roman" w:cs="Times New Roman" w:eastAsia="Times New Roman" w:hAnsi="Times New Roman"/>
-          <w:i/>
-          <w:iCs/>
-          <w:color w:val="888888"/>
-          <w:sz w:val="18"/>
-          <w:szCs w:val="18"/>
-        </w:rPr>
-        <w:t xml:space="preserve"> [texto final aplicado]</w:t>
+        <w:t xml:space="preserve">Esses serviços serão realizados no Quartel de cada OBM com abrangência em toda sua área de jurisdição.</w:t>
       </w:r>
     </w:p>
     <w:p>
@@ -3538,18 +3374,7 @@
           <w:sz w:val="24"/>
           <w:szCs w:val="24"/>
         </w:rPr>
-        <w:t xml:space="preserve">(dispositivo suprimido — decisão registrada no portal)</w:t>
-      </w:r>
-      <w:r>
-        <w:rPr>
-          <w:rFonts w:ascii="Times New Roman" w:cs="Times New Roman" w:eastAsia="Times New Roman" w:hAnsi="Times New Roman"/>
-          <w:i/>
-          <w:iCs/>
-          <w:color w:val="888888"/>
-          <w:sz w:val="18"/>
-          <w:szCs w:val="18"/>
-        </w:rPr>
-        <w:t xml:space="preserve"> [texto final aplicado]</w:t>
+        <w:t xml:space="preserve">Os casos omissos serão resolvidos em conjunto pelo Comandante Operacional de Bombeiros e pelo Comandante da OBM. Operações</w:t>
       </w:r>
     </w:p>
     <w:p>

</xml_diff>